<commit_message>
feat: resume x JD match diagnosis, AI interviewer, career planning and salary analysis (phase 2)
</commit_message>
<xml_diff>
--- a/docs/学号_姓名_Project Start Report_V1.0.docx
+++ b/docs/学号_姓名_Project Start Report_V1.0.docx
@@ -266,6 +266,122 @@
             </w:r>
           </w:p>
         </w:tc>
+        <w:tr>
+          <w:tc>
+            <w:tcPr>
+              <w:tcW w:type="dxa" w:w="1383"/>
+            </w:tcPr>
+            <w:p>
+              <w:pPr>
+                <w:jc w:val="center"/>
+              </w:pPr>
+              <w:r/>
+              <w:r>
+                <w:rPr>
+                  <w:rFonts w:ascii="Times New Roman" w:hAnsi="Times New Roman" w:eastAsia="宋体"/>
+                  <w:b w:val="0"/>
+                  <w:sz w:val="20"/>
+                </w:rPr>
+                <w:t>2026-08-27</w:t>
+              </w:r>
+            </w:p>
+          </w:tc>
+          <w:tc>
+            <w:tcPr>
+              <w:tcW w:type="dxa" w:w="1383"/>
+            </w:tcPr>
+            <w:p>
+              <w:pPr>
+                <w:jc w:val="center"/>
+              </w:pPr>
+              <w:r/>
+              <w:r>
+                <w:rPr>
+                  <w:rFonts w:ascii="Times New Roman" w:hAnsi="Times New Roman" w:eastAsia="宋体"/>
+                  <w:b w:val="0"/>
+                  <w:sz w:val="20"/>
+                </w:rPr>
+                <w:t>V1.1</w:t>
+              </w:r>
+            </w:p>
+          </w:tc>
+          <w:tc>
+            <w:tcPr>
+              <w:tcW w:type="dxa" w:w="1383"/>
+            </w:tcPr>
+            <w:p>
+              <w:pPr>
+                <w:jc w:val="center"/>
+              </w:pPr>
+              <w:r/>
+              <w:r>
+                <w:rPr>
+                  <w:rFonts w:ascii="Times New Roman" w:hAnsi="Times New Roman" w:eastAsia="宋体"/>
+                  <w:b w:val="0"/>
+                  <w:sz w:val="20"/>
+                </w:rPr>
+                <w:t>—</w:t>
+              </w:r>
+            </w:p>
+          </w:tc>
+          <w:tc>
+            <w:tcPr>
+              <w:tcW w:type="dxa" w:w="1383"/>
+            </w:tcPr>
+            <w:p>
+              <w:pPr>
+                <w:jc w:val="center"/>
+              </w:pPr>
+              <w:r/>
+              <w:r>
+                <w:rPr>
+                  <w:rFonts w:ascii="Times New Roman" w:hAnsi="Times New Roman" w:eastAsia="宋体"/>
+                  <w:b w:val="0"/>
+                  <w:sz w:val="20"/>
+                </w:rPr>
+                <w:t>3.4</w:t>
+              </w:r>
+            </w:p>
+          </w:tc>
+          <w:tc>
+            <w:tcPr>
+              <w:tcW w:type="dxa" w:w="1383"/>
+            </w:tcPr>
+            <w:p>
+              <w:pPr>
+                <w:jc w:val="center"/>
+              </w:pPr>
+              <w:r/>
+              <w:r>
+                <w:rPr>
+                  <w:rFonts w:ascii="Times New Roman" w:hAnsi="Times New Roman" w:eastAsia="宋体"/>
+                  <w:b w:val="0"/>
+                  <w:sz w:val="20"/>
+                </w:rPr>
+                <w:t>新增 JD 历史保存/选择与多简历选择诊断：用户可保存多份岗位 JD 并在诊断时选择历史 JD；上传多份简历时可选特定一份参与简历×JD 匹配计算；修复前端白屏问题（preserveSymlinks 处理中文路径编码）。</w:t>
+              </w:r>
+            </w:p>
+          </w:tc>
+          <w:tc>
+            <w:tcPr>
+              <w:tcW w:type="dxa" w:w="1383"/>
+            </w:tcPr>
+            <w:p>
+              <w:pPr>
+                <w:jc w:val="center"/>
+              </w:pPr>
+              <w:r/>
+              <w:r>
+                <w:rPr>
+                  <w:rFonts w:ascii="Times New Roman" w:hAnsi="Times New Roman" w:eastAsia="宋体"/>
+                  <w:b w:val="0"/>
+                  <w:sz w:val="20"/>
+                </w:rPr>
+                <w:t>（填写姓名）</w:t>
+              </w:r>
+            </w:p>
+          </w:tc>
+        </w:tr>
       </w:tr>
     </w:tbl>
     <w:p>
@@ -628,6 +744,122 @@
             </w:r>
           </w:p>
         </w:tc>
+        <w:tr>
+          <w:tc>
+            <w:tcPr>
+              <w:tcW w:type="dxa" w:w="1383"/>
+            </w:tcPr>
+            <w:p>
+              <w:pPr>
+                <w:jc w:val="center"/>
+              </w:pPr>
+              <w:r/>
+              <w:r>
+                <w:rPr>
+                  <w:rFonts w:ascii="Times New Roman" w:hAnsi="Times New Roman" w:eastAsia="宋体"/>
+                  <w:b w:val="0"/>
+                  <w:sz w:val="20"/>
+                </w:rPr>
+                <w:t>2026-08-27</w:t>
+              </w:r>
+            </w:p>
+          </w:tc>
+          <w:tc>
+            <w:tcPr>
+              <w:tcW w:type="dxa" w:w="1383"/>
+            </w:tcPr>
+            <w:p>
+              <w:pPr>
+                <w:jc w:val="center"/>
+              </w:pPr>
+              <w:r/>
+              <w:r>
+                <w:rPr>
+                  <w:rFonts w:ascii="Times New Roman" w:hAnsi="Times New Roman" w:eastAsia="宋体"/>
+                  <w:b w:val="0"/>
+                  <w:sz w:val="20"/>
+                </w:rPr>
+                <w:t>V1.1</w:t>
+              </w:r>
+            </w:p>
+          </w:tc>
+          <w:tc>
+            <w:tcPr>
+              <w:tcW w:type="dxa" w:w="1383"/>
+            </w:tcPr>
+            <w:p>
+              <w:pPr>
+                <w:jc w:val="center"/>
+              </w:pPr>
+              <w:r/>
+              <w:r>
+                <w:rPr>
+                  <w:rFonts w:ascii="Times New Roman" w:hAnsi="Times New Roman" w:eastAsia="宋体"/>
+                  <w:b w:val="0"/>
+                  <w:sz w:val="20"/>
+                </w:rPr>
+                <w:t>—</w:t>
+              </w:r>
+            </w:p>
+          </w:tc>
+          <w:tc>
+            <w:tcPr>
+              <w:tcW w:type="dxa" w:w="1383"/>
+            </w:tcPr>
+            <w:p>
+              <w:pPr>
+                <w:jc w:val="center"/>
+              </w:pPr>
+              <w:r/>
+              <w:r>
+                <w:rPr>
+                  <w:rFonts w:ascii="Times New Roman" w:hAnsi="Times New Roman" w:eastAsia="宋体"/>
+                  <w:b w:val="0"/>
+                  <w:sz w:val="20"/>
+                </w:rPr>
+                <w:t>3.4</w:t>
+              </w:r>
+            </w:p>
+          </w:tc>
+          <w:tc>
+            <w:tcPr>
+              <w:tcW w:type="dxa" w:w="1383"/>
+            </w:tcPr>
+            <w:p>
+              <w:pPr>
+                <w:jc w:val="center"/>
+              </w:pPr>
+              <w:r/>
+              <w:r>
+                <w:rPr>
+                  <w:rFonts w:ascii="Times New Roman" w:hAnsi="Times New Roman" w:eastAsia="宋体"/>
+                  <w:b w:val="0"/>
+                  <w:sz w:val="20"/>
+                </w:rPr>
+                <w:t>新增 JD 历史保存/选择与多简历选择诊断：用户可保存多份岗位 JD 并在诊断时选择历史 JD；上传多份简历时可选特定一份参与简历×JD 匹配计算；修复前端白屏问题（preserveSymlinks 处理中文路径编码）。</w:t>
+              </w:r>
+            </w:p>
+          </w:tc>
+          <w:tc>
+            <w:tcPr>
+              <w:tcW w:type="dxa" w:w="1383"/>
+            </w:tcPr>
+            <w:p>
+              <w:pPr>
+                <w:jc w:val="center"/>
+              </w:pPr>
+              <w:r/>
+              <w:r>
+                <w:rPr>
+                  <w:rFonts w:ascii="Times New Roman" w:hAnsi="Times New Roman" w:eastAsia="宋体"/>
+                  <w:b w:val="0"/>
+                  <w:sz w:val="20"/>
+                </w:rPr>
+                <w:t>（填写姓名）</w:t>
+              </w:r>
+            </w:p>
+          </w:tc>
+        </w:tr>
       </w:tr>
     </w:tbl>
     <w:p>
@@ -1778,6 +2010,122 @@
             </w:r>
           </w:p>
         </w:tc>
+        <w:tr>
+          <w:tc>
+            <w:tcPr>
+              <w:tcW w:type="dxa" w:w="1383"/>
+            </w:tcPr>
+            <w:p>
+              <w:pPr>
+                <w:jc w:val="center"/>
+              </w:pPr>
+              <w:r/>
+              <w:r>
+                <w:rPr>
+                  <w:rFonts w:ascii="Times New Roman" w:hAnsi="Times New Roman" w:eastAsia="宋体"/>
+                  <w:b w:val="0"/>
+                  <w:sz w:val="20"/>
+                </w:rPr>
+                <w:t>2026-08-27</w:t>
+              </w:r>
+            </w:p>
+          </w:tc>
+          <w:tc>
+            <w:tcPr>
+              <w:tcW w:type="dxa" w:w="1383"/>
+            </w:tcPr>
+            <w:p>
+              <w:pPr>
+                <w:jc w:val="center"/>
+              </w:pPr>
+              <w:r/>
+              <w:r>
+                <w:rPr>
+                  <w:rFonts w:ascii="Times New Roman" w:hAnsi="Times New Roman" w:eastAsia="宋体"/>
+                  <w:b w:val="0"/>
+                  <w:sz w:val="20"/>
+                </w:rPr>
+                <w:t>V1.1</w:t>
+              </w:r>
+            </w:p>
+          </w:tc>
+          <w:tc>
+            <w:tcPr>
+              <w:tcW w:type="dxa" w:w="1383"/>
+            </w:tcPr>
+            <w:p>
+              <w:pPr>
+                <w:jc w:val="center"/>
+              </w:pPr>
+              <w:r/>
+              <w:r>
+                <w:rPr>
+                  <w:rFonts w:ascii="Times New Roman" w:hAnsi="Times New Roman" w:eastAsia="宋体"/>
+                  <w:b w:val="0"/>
+                  <w:sz w:val="20"/>
+                </w:rPr>
+                <w:t>—</w:t>
+              </w:r>
+            </w:p>
+          </w:tc>
+          <w:tc>
+            <w:tcPr>
+              <w:tcW w:type="dxa" w:w="1383"/>
+            </w:tcPr>
+            <w:p>
+              <w:pPr>
+                <w:jc w:val="center"/>
+              </w:pPr>
+              <w:r/>
+              <w:r>
+                <w:rPr>
+                  <w:rFonts w:ascii="Times New Roman" w:hAnsi="Times New Roman" w:eastAsia="宋体"/>
+                  <w:b w:val="0"/>
+                  <w:sz w:val="20"/>
+                </w:rPr>
+                <w:t>3.4</w:t>
+              </w:r>
+            </w:p>
+          </w:tc>
+          <w:tc>
+            <w:tcPr>
+              <w:tcW w:type="dxa" w:w="1383"/>
+            </w:tcPr>
+            <w:p>
+              <w:pPr>
+                <w:jc w:val="center"/>
+              </w:pPr>
+              <w:r/>
+              <w:r>
+                <w:rPr>
+                  <w:rFonts w:ascii="Times New Roman" w:hAnsi="Times New Roman" w:eastAsia="宋体"/>
+                  <w:b w:val="0"/>
+                  <w:sz w:val="20"/>
+                </w:rPr>
+                <w:t>新增 JD 历史保存/选择与多简历选择诊断：用户可保存多份岗位 JD 并在诊断时选择历史 JD；上传多份简历时可选特定一份参与简历×JD 匹配计算；修复前端白屏问题（preserveSymlinks 处理中文路径编码）。</w:t>
+              </w:r>
+            </w:p>
+          </w:tc>
+          <w:tc>
+            <w:tcPr>
+              <w:tcW w:type="dxa" w:w="1383"/>
+            </w:tcPr>
+            <w:p>
+              <w:pPr>
+                <w:jc w:val="center"/>
+              </w:pPr>
+              <w:r/>
+              <w:r>
+                <w:rPr>
+                  <w:rFonts w:ascii="Times New Roman" w:hAnsi="Times New Roman" w:eastAsia="宋体"/>
+                  <w:b w:val="0"/>
+                  <w:sz w:val="20"/>
+                </w:rPr>
+                <w:t>（填写姓名）</w:t>
+              </w:r>
+            </w:p>
+          </w:tc>
+        </w:tr>
       </w:tr>
     </w:tbl>
     <w:p>

</xml_diff>

<commit_message>
docs: update project start report revision record to V1.2 (interview history review & ability profile)
</commit_message>
<xml_diff>
--- a/docs/学号_姓名_Project Start Report_V1.0.docx
+++ b/docs/学号_姓名_Project Start Report_V1.0.docx
@@ -359,6 +359,122 @@
                   <w:sz w:val="20"/>
                 </w:rPr>
                 <w:t>新增 JD 历史保存/选择与多简历选择诊断：用户可保存多份岗位 JD 并在诊断时选择历史 JD；上传多份简历时可选特定一份参与简历×JD 匹配计算；修复前端白屏问题（preserveSymlinks 处理中文路径编码）。</w:t>
+              </w:r>
+            </w:p>
+          </w:tc>
+          <w:tc>
+            <w:tcPr>
+              <w:tcW w:type="dxa" w:w="1383"/>
+            </w:tcPr>
+            <w:p>
+              <w:pPr>
+                <w:jc w:val="center"/>
+              </w:pPr>
+              <w:r/>
+              <w:r>
+                <w:rPr>
+                  <w:rFonts w:ascii="Times New Roman" w:hAnsi="Times New Roman" w:eastAsia="宋体"/>
+                  <w:b w:val="0"/>
+                  <w:sz w:val="20"/>
+                </w:rPr>
+                <w:t>（填写姓名）</w:t>
+              </w:r>
+            </w:p>
+          </w:tc>
+        </w:tr>
+        <w:tr>
+          <w:tc>
+            <w:tcPr>
+              <w:tcW w:type="dxa" w:w="1383"/>
+            </w:tcPr>
+            <w:p>
+              <w:pPr>
+                <w:jc w:val="center"/>
+              </w:pPr>
+              <w:r/>
+              <w:r>
+                <w:rPr>
+                  <w:rFonts w:ascii="Times New Roman" w:hAnsi="Times New Roman" w:eastAsia="宋体"/>
+                  <w:b w:val="0"/>
+                  <w:sz w:val="20"/>
+                </w:rPr>
+                <w:t>2026-08-27</w:t>
+              </w:r>
+            </w:p>
+          </w:tc>
+          <w:tc>
+            <w:tcPr>
+              <w:tcW w:type="dxa" w:w="1383"/>
+            </w:tcPr>
+            <w:p>
+              <w:pPr>
+                <w:jc w:val="center"/>
+              </w:pPr>
+              <w:r/>
+              <w:r>
+                <w:rPr>
+                  <w:rFonts w:ascii="Times New Roman" w:hAnsi="Times New Roman" w:eastAsia="宋体"/>
+                  <w:b w:val="0"/>
+                  <w:sz w:val="20"/>
+                </w:rPr>
+                <w:t>V1.2</w:t>
+              </w:r>
+            </w:p>
+          </w:tc>
+          <w:tc>
+            <w:tcPr>
+              <w:tcW w:type="dxa" w:w="1383"/>
+            </w:tcPr>
+            <w:p>
+              <w:pPr>
+                <w:jc w:val="center"/>
+              </w:pPr>
+              <w:r/>
+              <w:r>
+                <w:rPr>
+                  <w:rFonts w:ascii="Times New Roman" w:hAnsi="Times New Roman" w:eastAsia="宋体"/>
+                  <w:b w:val="0"/>
+                  <w:sz w:val="20"/>
+                </w:rPr>
+                <w:t>—</w:t>
+              </w:r>
+            </w:p>
+          </w:tc>
+          <w:tc>
+            <w:tcPr>
+              <w:tcW w:type="dxa" w:w="1383"/>
+            </w:tcPr>
+            <w:p>
+              <w:pPr>
+                <w:jc w:val="center"/>
+              </w:pPr>
+              <w:r/>
+              <w:r>
+                <w:rPr>
+                  <w:rFonts w:ascii="Times New Roman" w:hAnsi="Times New Roman" w:eastAsia="宋体"/>
+                  <w:b w:val="0"/>
+                  <w:sz w:val="20"/>
+                </w:rPr>
+                <w:t>全部</w:t>
+              </w:r>
+            </w:p>
+          </w:tc>
+          <w:tc>
+            <w:tcPr>
+              <w:tcW w:type="dxa" w:w="1383"/>
+            </w:tcPr>
+            <w:p>
+              <w:pPr>
+                <w:jc w:val="center"/>
+              </w:pPr>
+              <w:r/>
+              <w:r>
+                <w:rPr>
+                  <w:rFonts w:ascii="Times New Roman" w:hAnsi="Times New Roman" w:eastAsia="宋体"/>
+                  <w:b w:val="0"/>
+                  <w:sz w:val="20"/>
+                </w:rPr>
+                <w:t>新增模拟面试历史记录保存与逐题复盘（可点击历史场次回看问题与AI评估）；完善能力画像（多维度雷达图与维度说明同步展示）；新增转行诊断与谈薪模拟模块；代码已推送GitHub（phase 3）。</w:t>
               </w:r>
             </w:p>
           </w:tc>
@@ -837,6 +953,122 @@
                   <w:sz w:val="20"/>
                 </w:rPr>
                 <w:t>新增 JD 历史保存/选择与多简历选择诊断：用户可保存多份岗位 JD 并在诊断时选择历史 JD；上传多份简历时可选特定一份参与简历×JD 匹配计算；修复前端白屏问题（preserveSymlinks 处理中文路径编码）。</w:t>
+              </w:r>
+            </w:p>
+          </w:tc>
+          <w:tc>
+            <w:tcPr>
+              <w:tcW w:type="dxa" w:w="1383"/>
+            </w:tcPr>
+            <w:p>
+              <w:pPr>
+                <w:jc w:val="center"/>
+              </w:pPr>
+              <w:r/>
+              <w:r>
+                <w:rPr>
+                  <w:rFonts w:ascii="Times New Roman" w:hAnsi="Times New Roman" w:eastAsia="宋体"/>
+                  <w:b w:val="0"/>
+                  <w:sz w:val="20"/>
+                </w:rPr>
+                <w:t>（填写姓名）</w:t>
+              </w:r>
+            </w:p>
+          </w:tc>
+        </w:tr>
+        <w:tr>
+          <w:tc>
+            <w:tcPr>
+              <w:tcW w:type="dxa" w:w="1383"/>
+            </w:tcPr>
+            <w:p>
+              <w:pPr>
+                <w:jc w:val="center"/>
+              </w:pPr>
+              <w:r/>
+              <w:r>
+                <w:rPr>
+                  <w:rFonts w:ascii="Times New Roman" w:hAnsi="Times New Roman" w:eastAsia="宋体"/>
+                  <w:b w:val="0"/>
+                  <w:sz w:val="20"/>
+                </w:rPr>
+                <w:t>2026-08-27</w:t>
+              </w:r>
+            </w:p>
+          </w:tc>
+          <w:tc>
+            <w:tcPr>
+              <w:tcW w:type="dxa" w:w="1383"/>
+            </w:tcPr>
+            <w:p>
+              <w:pPr>
+                <w:jc w:val="center"/>
+              </w:pPr>
+              <w:r/>
+              <w:r>
+                <w:rPr>
+                  <w:rFonts w:ascii="Times New Roman" w:hAnsi="Times New Roman" w:eastAsia="宋体"/>
+                  <w:b w:val="0"/>
+                  <w:sz w:val="20"/>
+                </w:rPr>
+                <w:t>V1.2</w:t>
+              </w:r>
+            </w:p>
+          </w:tc>
+          <w:tc>
+            <w:tcPr>
+              <w:tcW w:type="dxa" w:w="1383"/>
+            </w:tcPr>
+            <w:p>
+              <w:pPr>
+                <w:jc w:val="center"/>
+              </w:pPr>
+              <w:r/>
+              <w:r>
+                <w:rPr>
+                  <w:rFonts w:ascii="Times New Roman" w:hAnsi="Times New Roman" w:eastAsia="宋体"/>
+                  <w:b w:val="0"/>
+                  <w:sz w:val="20"/>
+                </w:rPr>
+                <w:t>—</w:t>
+              </w:r>
+            </w:p>
+          </w:tc>
+          <w:tc>
+            <w:tcPr>
+              <w:tcW w:type="dxa" w:w="1383"/>
+            </w:tcPr>
+            <w:p>
+              <w:pPr>
+                <w:jc w:val="center"/>
+              </w:pPr>
+              <w:r/>
+              <w:r>
+                <w:rPr>
+                  <w:rFonts w:ascii="Times New Roman" w:hAnsi="Times New Roman" w:eastAsia="宋体"/>
+                  <w:b w:val="0"/>
+                  <w:sz w:val="20"/>
+                </w:rPr>
+                <w:t>全部</w:t>
+              </w:r>
+            </w:p>
+          </w:tc>
+          <w:tc>
+            <w:tcPr>
+              <w:tcW w:type="dxa" w:w="1383"/>
+            </w:tcPr>
+            <w:p>
+              <w:pPr>
+                <w:jc w:val="center"/>
+              </w:pPr>
+              <w:r/>
+              <w:r>
+                <w:rPr>
+                  <w:rFonts w:ascii="Times New Roman" w:hAnsi="Times New Roman" w:eastAsia="宋体"/>
+                  <w:b w:val="0"/>
+                  <w:sz w:val="20"/>
+                </w:rPr>
+                <w:t>新增模拟面试历史记录保存与逐题复盘（可点击历史场次回看问题与AI评估）；完善能力画像（多维度雷达图与维度说明同步展示）；新增转行诊断与谈薪模拟模块；代码已推送GitHub（phase 3）。</w:t>
               </w:r>
             </w:p>
           </w:tc>
@@ -2126,6 +2358,122 @@
             </w:p>
           </w:tc>
         </w:tr>
+        <w:tr>
+          <w:tc>
+            <w:tcPr>
+              <w:tcW w:type="dxa" w:w="1383"/>
+            </w:tcPr>
+            <w:p>
+              <w:pPr>
+                <w:jc w:val="center"/>
+              </w:pPr>
+              <w:r/>
+              <w:r>
+                <w:rPr>
+                  <w:rFonts w:ascii="Times New Roman" w:hAnsi="Times New Roman" w:eastAsia="宋体"/>
+                  <w:b w:val="0"/>
+                  <w:sz w:val="20"/>
+                </w:rPr>
+                <w:t>2026-08-27</w:t>
+              </w:r>
+            </w:p>
+          </w:tc>
+          <w:tc>
+            <w:tcPr>
+              <w:tcW w:type="dxa" w:w="1383"/>
+            </w:tcPr>
+            <w:p>
+              <w:pPr>
+                <w:jc w:val="center"/>
+              </w:pPr>
+              <w:r/>
+              <w:r>
+                <w:rPr>
+                  <w:rFonts w:ascii="Times New Roman" w:hAnsi="Times New Roman" w:eastAsia="宋体"/>
+                  <w:b w:val="0"/>
+                  <w:sz w:val="20"/>
+                </w:rPr>
+                <w:t>V1.2</w:t>
+              </w:r>
+            </w:p>
+          </w:tc>
+          <w:tc>
+            <w:tcPr>
+              <w:tcW w:type="dxa" w:w="1383"/>
+            </w:tcPr>
+            <w:p>
+              <w:pPr>
+                <w:jc w:val="center"/>
+              </w:pPr>
+              <w:r/>
+              <w:r>
+                <w:rPr>
+                  <w:rFonts w:ascii="Times New Roman" w:hAnsi="Times New Roman" w:eastAsia="宋体"/>
+                  <w:b w:val="0"/>
+                  <w:sz w:val="20"/>
+                </w:rPr>
+                <w:t>—</w:t>
+              </w:r>
+            </w:p>
+          </w:tc>
+          <w:tc>
+            <w:tcPr>
+              <w:tcW w:type="dxa" w:w="1383"/>
+            </w:tcPr>
+            <w:p>
+              <w:pPr>
+                <w:jc w:val="center"/>
+              </w:pPr>
+              <w:r/>
+              <w:r>
+                <w:rPr>
+                  <w:rFonts w:ascii="Times New Roman" w:hAnsi="Times New Roman" w:eastAsia="宋体"/>
+                  <w:b w:val="0"/>
+                  <w:sz w:val="20"/>
+                </w:rPr>
+                <w:t>全部</w:t>
+              </w:r>
+            </w:p>
+          </w:tc>
+          <w:tc>
+            <w:tcPr>
+              <w:tcW w:type="dxa" w:w="1383"/>
+            </w:tcPr>
+            <w:p>
+              <w:pPr>
+                <w:jc w:val="center"/>
+              </w:pPr>
+              <w:r/>
+              <w:r>
+                <w:rPr>
+                  <w:rFonts w:ascii="Times New Roman" w:hAnsi="Times New Roman" w:eastAsia="宋体"/>
+                  <w:b w:val="0"/>
+                  <w:sz w:val="20"/>
+                </w:rPr>
+                <w:t>新增模拟面试历史记录保存与逐题复盘（可点击历史场次回看问题与AI评估）；完善能力画像（多维度雷达图与维度说明同步展示）；新增转行诊断与谈薪模拟模块；代码已推送GitHub（phase 3）。</w:t>
+              </w:r>
+            </w:p>
+          </w:tc>
+          <w:tc>
+            <w:tcPr>
+              <w:tcW w:type="dxa" w:w="1383"/>
+            </w:tcPr>
+            <w:p>
+              <w:pPr>
+                <w:jc w:val="center"/>
+              </w:pPr>
+              <w:r/>
+              <w:r>
+                <w:rPr>
+                  <w:rFonts w:ascii="Times New Roman" w:hAnsi="Times New Roman" w:eastAsia="宋体"/>
+                  <w:b w:val="0"/>
+                  <w:sz w:val="20"/>
+                </w:rPr>
+                <w:t>（填写姓名）</w:t>
+              </w:r>
+            </w:p>
+          </w:tc>
+        </w:tr>
       </w:tr>
     </w:tbl>
     <w:p>

</xml_diff>

<commit_message>
fix: repair corrupted table structure in project start report docx (invalid nested w:tr rows)
</commit_message>
<xml_diff>
--- a/docs/学号_姓名_Project Start Report_V1.0.docx
+++ b/docs/学号_姓名_Project Start Report_V1.0.docx
@@ -266,238 +266,6 @@
             </w:r>
           </w:p>
         </w:tc>
-        <w:tr>
-          <w:tc>
-            <w:tcPr>
-              <w:tcW w:type="dxa" w:w="1383"/>
-            </w:tcPr>
-            <w:p>
-              <w:pPr>
-                <w:jc w:val="center"/>
-              </w:pPr>
-              <w:r/>
-              <w:r>
-                <w:rPr>
-                  <w:rFonts w:ascii="Times New Roman" w:hAnsi="Times New Roman" w:eastAsia="宋体"/>
-                  <w:b w:val="0"/>
-                  <w:sz w:val="20"/>
-                </w:rPr>
-                <w:t>2026-08-27</w:t>
-              </w:r>
-            </w:p>
-          </w:tc>
-          <w:tc>
-            <w:tcPr>
-              <w:tcW w:type="dxa" w:w="1383"/>
-            </w:tcPr>
-            <w:p>
-              <w:pPr>
-                <w:jc w:val="center"/>
-              </w:pPr>
-              <w:r/>
-              <w:r>
-                <w:rPr>
-                  <w:rFonts w:ascii="Times New Roman" w:hAnsi="Times New Roman" w:eastAsia="宋体"/>
-                  <w:b w:val="0"/>
-                  <w:sz w:val="20"/>
-                </w:rPr>
-                <w:t>V1.1</w:t>
-              </w:r>
-            </w:p>
-          </w:tc>
-          <w:tc>
-            <w:tcPr>
-              <w:tcW w:type="dxa" w:w="1383"/>
-            </w:tcPr>
-            <w:p>
-              <w:pPr>
-                <w:jc w:val="center"/>
-              </w:pPr>
-              <w:r/>
-              <w:r>
-                <w:rPr>
-                  <w:rFonts w:ascii="Times New Roman" w:hAnsi="Times New Roman" w:eastAsia="宋体"/>
-                  <w:b w:val="0"/>
-                  <w:sz w:val="20"/>
-                </w:rPr>
-                <w:t>—</w:t>
-              </w:r>
-            </w:p>
-          </w:tc>
-          <w:tc>
-            <w:tcPr>
-              <w:tcW w:type="dxa" w:w="1383"/>
-            </w:tcPr>
-            <w:p>
-              <w:pPr>
-                <w:jc w:val="center"/>
-              </w:pPr>
-              <w:r/>
-              <w:r>
-                <w:rPr>
-                  <w:rFonts w:ascii="Times New Roman" w:hAnsi="Times New Roman" w:eastAsia="宋体"/>
-                  <w:b w:val="0"/>
-                  <w:sz w:val="20"/>
-                </w:rPr>
-                <w:t>3.4</w:t>
-              </w:r>
-            </w:p>
-          </w:tc>
-          <w:tc>
-            <w:tcPr>
-              <w:tcW w:type="dxa" w:w="1383"/>
-            </w:tcPr>
-            <w:p>
-              <w:pPr>
-                <w:jc w:val="center"/>
-              </w:pPr>
-              <w:r/>
-              <w:r>
-                <w:rPr>
-                  <w:rFonts w:ascii="Times New Roman" w:hAnsi="Times New Roman" w:eastAsia="宋体"/>
-                  <w:b w:val="0"/>
-                  <w:sz w:val="20"/>
-                </w:rPr>
-                <w:t>新增 JD 历史保存/选择与多简历选择诊断：用户可保存多份岗位 JD 并在诊断时选择历史 JD；上传多份简历时可选特定一份参与简历×JD 匹配计算；修复前端白屏问题（preserveSymlinks 处理中文路径编码）。</w:t>
-              </w:r>
-            </w:p>
-          </w:tc>
-          <w:tc>
-            <w:tcPr>
-              <w:tcW w:type="dxa" w:w="1383"/>
-            </w:tcPr>
-            <w:p>
-              <w:pPr>
-                <w:jc w:val="center"/>
-              </w:pPr>
-              <w:r/>
-              <w:r>
-                <w:rPr>
-                  <w:rFonts w:ascii="Times New Roman" w:hAnsi="Times New Roman" w:eastAsia="宋体"/>
-                  <w:b w:val="0"/>
-                  <w:sz w:val="20"/>
-                </w:rPr>
-                <w:t>（填写姓名）</w:t>
-              </w:r>
-            </w:p>
-          </w:tc>
-        </w:tr>
-        <w:tr>
-          <w:tc>
-            <w:tcPr>
-              <w:tcW w:type="dxa" w:w="1383"/>
-            </w:tcPr>
-            <w:p>
-              <w:pPr>
-                <w:jc w:val="center"/>
-              </w:pPr>
-              <w:r/>
-              <w:r>
-                <w:rPr>
-                  <w:rFonts w:ascii="Times New Roman" w:hAnsi="Times New Roman" w:eastAsia="宋体"/>
-                  <w:b w:val="0"/>
-                  <w:sz w:val="20"/>
-                </w:rPr>
-                <w:t>2026-08-27</w:t>
-              </w:r>
-            </w:p>
-          </w:tc>
-          <w:tc>
-            <w:tcPr>
-              <w:tcW w:type="dxa" w:w="1383"/>
-            </w:tcPr>
-            <w:p>
-              <w:pPr>
-                <w:jc w:val="center"/>
-              </w:pPr>
-              <w:r/>
-              <w:r>
-                <w:rPr>
-                  <w:rFonts w:ascii="Times New Roman" w:hAnsi="Times New Roman" w:eastAsia="宋体"/>
-                  <w:b w:val="0"/>
-                  <w:sz w:val="20"/>
-                </w:rPr>
-                <w:t>V1.2</w:t>
-              </w:r>
-            </w:p>
-          </w:tc>
-          <w:tc>
-            <w:tcPr>
-              <w:tcW w:type="dxa" w:w="1383"/>
-            </w:tcPr>
-            <w:p>
-              <w:pPr>
-                <w:jc w:val="center"/>
-              </w:pPr>
-              <w:r/>
-              <w:r>
-                <w:rPr>
-                  <w:rFonts w:ascii="Times New Roman" w:hAnsi="Times New Roman" w:eastAsia="宋体"/>
-                  <w:b w:val="0"/>
-                  <w:sz w:val="20"/>
-                </w:rPr>
-                <w:t>—</w:t>
-              </w:r>
-            </w:p>
-          </w:tc>
-          <w:tc>
-            <w:tcPr>
-              <w:tcW w:type="dxa" w:w="1383"/>
-            </w:tcPr>
-            <w:p>
-              <w:pPr>
-                <w:jc w:val="center"/>
-              </w:pPr>
-              <w:r/>
-              <w:r>
-                <w:rPr>
-                  <w:rFonts w:ascii="Times New Roman" w:hAnsi="Times New Roman" w:eastAsia="宋体"/>
-                  <w:b w:val="0"/>
-                  <w:sz w:val="20"/>
-                </w:rPr>
-                <w:t>全部</w:t>
-              </w:r>
-            </w:p>
-          </w:tc>
-          <w:tc>
-            <w:tcPr>
-              <w:tcW w:type="dxa" w:w="1383"/>
-            </w:tcPr>
-            <w:p>
-              <w:pPr>
-                <w:jc w:val="center"/>
-              </w:pPr>
-              <w:r/>
-              <w:r>
-                <w:rPr>
-                  <w:rFonts w:ascii="Times New Roman" w:hAnsi="Times New Roman" w:eastAsia="宋体"/>
-                  <w:b w:val="0"/>
-                  <w:sz w:val="20"/>
-                </w:rPr>
-                <w:t>新增模拟面试历史记录保存与逐题复盘（可点击历史场次回看问题与AI评估）；完善能力画像（多维度雷达图与维度说明同步展示）；新增转行诊断与谈薪模拟模块；代码已推送GitHub（phase 3）。</w:t>
-              </w:r>
-            </w:p>
-          </w:tc>
-          <w:tc>
-            <w:tcPr>
-              <w:tcW w:type="dxa" w:w="1383"/>
-            </w:tcPr>
-            <w:p>
-              <w:pPr>
-                <w:jc w:val="center"/>
-              </w:pPr>
-              <w:r/>
-              <w:r>
-                <w:rPr>
-                  <w:rFonts w:ascii="Times New Roman" w:hAnsi="Times New Roman" w:eastAsia="宋体"/>
-                  <w:b w:val="0"/>
-                  <w:sz w:val="20"/>
-                </w:rPr>
-                <w:t>（填写姓名）</w:t>
-              </w:r>
-            </w:p>
-          </w:tc>
-        </w:tr>
       </w:tr>
     </w:tbl>
     <w:p>
@@ -860,238 +628,238 @@
             </w:r>
           </w:p>
         </w:tc>
-        <w:tr>
-          <w:tc>
-            <w:tcPr>
-              <w:tcW w:type="dxa" w:w="1383"/>
-            </w:tcPr>
-            <w:p>
-              <w:pPr>
-                <w:jc w:val="center"/>
-              </w:pPr>
-              <w:r/>
-              <w:r>
-                <w:rPr>
-                  <w:rFonts w:ascii="Times New Roman" w:hAnsi="Times New Roman" w:eastAsia="宋体"/>
-                  <w:b w:val="0"/>
-                  <w:sz w:val="20"/>
-                </w:rPr>
-                <w:t>2026-08-27</w:t>
-              </w:r>
-            </w:p>
-          </w:tc>
-          <w:tc>
-            <w:tcPr>
-              <w:tcW w:type="dxa" w:w="1383"/>
-            </w:tcPr>
-            <w:p>
-              <w:pPr>
-                <w:jc w:val="center"/>
-              </w:pPr>
-              <w:r/>
-              <w:r>
-                <w:rPr>
-                  <w:rFonts w:ascii="Times New Roman" w:hAnsi="Times New Roman" w:eastAsia="宋体"/>
-                  <w:b w:val="0"/>
-                  <w:sz w:val="20"/>
-                </w:rPr>
-                <w:t>V1.1</w:t>
-              </w:r>
-            </w:p>
-          </w:tc>
-          <w:tc>
-            <w:tcPr>
-              <w:tcW w:type="dxa" w:w="1383"/>
-            </w:tcPr>
-            <w:p>
-              <w:pPr>
-                <w:jc w:val="center"/>
-              </w:pPr>
-              <w:r/>
-              <w:r>
-                <w:rPr>
-                  <w:rFonts w:ascii="Times New Roman" w:hAnsi="Times New Roman" w:eastAsia="宋体"/>
-                  <w:b w:val="0"/>
-                  <w:sz w:val="20"/>
-                </w:rPr>
-                <w:t>—</w:t>
-              </w:r>
-            </w:p>
-          </w:tc>
-          <w:tc>
-            <w:tcPr>
-              <w:tcW w:type="dxa" w:w="1383"/>
-            </w:tcPr>
-            <w:p>
-              <w:pPr>
-                <w:jc w:val="center"/>
-              </w:pPr>
-              <w:r/>
-              <w:r>
-                <w:rPr>
-                  <w:rFonts w:ascii="Times New Roman" w:hAnsi="Times New Roman" w:eastAsia="宋体"/>
-                  <w:b w:val="0"/>
-                  <w:sz w:val="20"/>
-                </w:rPr>
-                <w:t>3.4</w:t>
-              </w:r>
-            </w:p>
-          </w:tc>
-          <w:tc>
-            <w:tcPr>
-              <w:tcW w:type="dxa" w:w="1383"/>
-            </w:tcPr>
-            <w:p>
-              <w:pPr>
-                <w:jc w:val="center"/>
-              </w:pPr>
-              <w:r/>
-              <w:r>
-                <w:rPr>
-                  <w:rFonts w:ascii="Times New Roman" w:hAnsi="Times New Roman" w:eastAsia="宋体"/>
-                  <w:b w:val="0"/>
-                  <w:sz w:val="20"/>
-                </w:rPr>
-                <w:t>新增 JD 历史保存/选择与多简历选择诊断：用户可保存多份岗位 JD 并在诊断时选择历史 JD；上传多份简历时可选特定一份参与简历×JD 匹配计算；修复前端白屏问题（preserveSymlinks 处理中文路径编码）。</w:t>
-              </w:r>
-            </w:p>
-          </w:tc>
-          <w:tc>
-            <w:tcPr>
-              <w:tcW w:type="dxa" w:w="1383"/>
-            </w:tcPr>
-            <w:p>
-              <w:pPr>
-                <w:jc w:val="center"/>
-              </w:pPr>
-              <w:r/>
-              <w:r>
-                <w:rPr>
-                  <w:rFonts w:ascii="Times New Roman" w:hAnsi="Times New Roman" w:eastAsia="宋体"/>
-                  <w:b w:val="0"/>
-                  <w:sz w:val="20"/>
-                </w:rPr>
-                <w:t>（填写姓名）</w:t>
-              </w:r>
-            </w:p>
-          </w:tc>
-        </w:tr>
-        <w:tr>
-          <w:tc>
-            <w:tcPr>
-              <w:tcW w:type="dxa" w:w="1383"/>
-            </w:tcPr>
-            <w:p>
-              <w:pPr>
-                <w:jc w:val="center"/>
-              </w:pPr>
-              <w:r/>
-              <w:r>
-                <w:rPr>
-                  <w:rFonts w:ascii="Times New Roman" w:hAnsi="Times New Roman" w:eastAsia="宋体"/>
-                  <w:b w:val="0"/>
-                  <w:sz w:val="20"/>
-                </w:rPr>
-                <w:t>2026-08-27</w:t>
-              </w:r>
-            </w:p>
-          </w:tc>
-          <w:tc>
-            <w:tcPr>
-              <w:tcW w:type="dxa" w:w="1383"/>
-            </w:tcPr>
-            <w:p>
-              <w:pPr>
-                <w:jc w:val="center"/>
-              </w:pPr>
-              <w:r/>
-              <w:r>
-                <w:rPr>
-                  <w:rFonts w:ascii="Times New Roman" w:hAnsi="Times New Roman" w:eastAsia="宋体"/>
-                  <w:b w:val="0"/>
-                  <w:sz w:val="20"/>
-                </w:rPr>
-                <w:t>V1.2</w:t>
-              </w:r>
-            </w:p>
-          </w:tc>
-          <w:tc>
-            <w:tcPr>
-              <w:tcW w:type="dxa" w:w="1383"/>
-            </w:tcPr>
-            <w:p>
-              <w:pPr>
-                <w:jc w:val="center"/>
-              </w:pPr>
-              <w:r/>
-              <w:r>
-                <w:rPr>
-                  <w:rFonts w:ascii="Times New Roman" w:hAnsi="Times New Roman" w:eastAsia="宋体"/>
-                  <w:b w:val="0"/>
-                  <w:sz w:val="20"/>
-                </w:rPr>
-                <w:t>—</w:t>
-              </w:r>
-            </w:p>
-          </w:tc>
-          <w:tc>
-            <w:tcPr>
-              <w:tcW w:type="dxa" w:w="1383"/>
-            </w:tcPr>
-            <w:p>
-              <w:pPr>
-                <w:jc w:val="center"/>
-              </w:pPr>
-              <w:r/>
-              <w:r>
-                <w:rPr>
-                  <w:rFonts w:ascii="Times New Roman" w:hAnsi="Times New Roman" w:eastAsia="宋体"/>
-                  <w:b w:val="0"/>
-                  <w:sz w:val="20"/>
-                </w:rPr>
-                <w:t>全部</w:t>
-              </w:r>
-            </w:p>
-          </w:tc>
-          <w:tc>
-            <w:tcPr>
-              <w:tcW w:type="dxa" w:w="1383"/>
-            </w:tcPr>
-            <w:p>
-              <w:pPr>
-                <w:jc w:val="center"/>
-              </w:pPr>
-              <w:r/>
-              <w:r>
-                <w:rPr>
-                  <w:rFonts w:ascii="Times New Roman" w:hAnsi="Times New Roman" w:eastAsia="宋体"/>
-                  <w:b w:val="0"/>
-                  <w:sz w:val="20"/>
-                </w:rPr>
-                <w:t>新增模拟面试历史记录保存与逐题复盘（可点击历史场次回看问题与AI评估）；完善能力画像（多维度雷达图与维度说明同步展示）；新增转行诊断与谈薪模拟模块；代码已推送GitHub（phase 3）。</w:t>
-              </w:r>
-            </w:p>
-          </w:tc>
-          <w:tc>
-            <w:tcPr>
-              <w:tcW w:type="dxa" w:w="1383"/>
-            </w:tcPr>
-            <w:p>
-              <w:pPr>
-                <w:jc w:val="center"/>
-              </w:pPr>
-              <w:r/>
-              <w:r>
-                <w:rPr>
-                  <w:rFonts w:ascii="Times New Roman" w:hAnsi="Times New Roman" w:eastAsia="宋体"/>
-                  <w:b w:val="0"/>
-                  <w:sz w:val="20"/>
-                </w:rPr>
-                <w:t>（填写姓名）</w:t>
-              </w:r>
-            </w:p>
-          </w:tc>
-        </w:tr>
+      </w:tr>
+      <w:tr>
+        <w:tc>
+          <w:tcPr>
+            <w:tcW w:type="dxa" w:w="1383"/>
+          </w:tcPr>
+          <w:p>
+            <w:pPr>
+              <w:jc w:val="center"/>
+            </w:pPr>
+            <w:r/>
+            <w:r>
+              <w:rPr>
+                <w:rFonts w:ascii="Times New Roman" w:hAnsi="Times New Roman" w:eastAsia="宋体"/>
+                <w:b w:val="0"/>
+                <w:sz w:val="20"/>
+              </w:rPr>
+              <w:t>2026-08-27</w:t>
+            </w:r>
+          </w:p>
+        </w:tc>
+        <w:tc>
+          <w:tcPr>
+            <w:tcW w:type="dxa" w:w="1383"/>
+          </w:tcPr>
+          <w:p>
+            <w:pPr>
+              <w:jc w:val="center"/>
+            </w:pPr>
+            <w:r/>
+            <w:r>
+              <w:rPr>
+                <w:rFonts w:ascii="Times New Roman" w:hAnsi="Times New Roman" w:eastAsia="宋体"/>
+                <w:b w:val="0"/>
+                <w:sz w:val="20"/>
+              </w:rPr>
+              <w:t>V1.1</w:t>
+            </w:r>
+          </w:p>
+        </w:tc>
+        <w:tc>
+          <w:tcPr>
+            <w:tcW w:type="dxa" w:w="1383"/>
+          </w:tcPr>
+          <w:p>
+            <w:pPr>
+              <w:jc w:val="center"/>
+            </w:pPr>
+            <w:r/>
+            <w:r>
+              <w:rPr>
+                <w:rFonts w:ascii="Times New Roman" w:hAnsi="Times New Roman" w:eastAsia="宋体"/>
+                <w:b w:val="0"/>
+                <w:sz w:val="20"/>
+              </w:rPr>
+              <w:t>—</w:t>
+            </w:r>
+          </w:p>
+        </w:tc>
+        <w:tc>
+          <w:tcPr>
+            <w:tcW w:type="dxa" w:w="1383"/>
+          </w:tcPr>
+          <w:p>
+            <w:pPr>
+              <w:jc w:val="center"/>
+            </w:pPr>
+            <w:r/>
+            <w:r>
+              <w:rPr>
+                <w:rFonts w:ascii="Times New Roman" w:hAnsi="Times New Roman" w:eastAsia="宋体"/>
+                <w:b w:val="0"/>
+                <w:sz w:val="20"/>
+              </w:rPr>
+              <w:t>3.4</w:t>
+            </w:r>
+          </w:p>
+        </w:tc>
+        <w:tc>
+          <w:tcPr>
+            <w:tcW w:type="dxa" w:w="1383"/>
+          </w:tcPr>
+          <w:p>
+            <w:pPr>
+              <w:jc w:val="center"/>
+            </w:pPr>
+            <w:r/>
+            <w:r>
+              <w:rPr>
+                <w:rFonts w:ascii="Times New Roman" w:hAnsi="Times New Roman" w:eastAsia="宋体"/>
+                <w:b w:val="0"/>
+                <w:sz w:val="20"/>
+              </w:rPr>
+              <w:t>新增 JD 历史保存/选择与多简历选择诊断：用户可保存多份岗位 JD 并在诊断时选择历史 JD；上传多份简历时可选特定一份参与简历×JD 匹配计算；修复前端白屏问题（preserveSymlinks 处理中文路径编码）。</w:t>
+            </w:r>
+          </w:p>
+        </w:tc>
+        <w:tc>
+          <w:tcPr>
+            <w:tcW w:type="dxa" w:w="1383"/>
+          </w:tcPr>
+          <w:p>
+            <w:pPr>
+              <w:jc w:val="center"/>
+            </w:pPr>
+            <w:r/>
+            <w:r>
+              <w:rPr>
+                <w:rFonts w:ascii="Times New Roman" w:hAnsi="Times New Roman" w:eastAsia="宋体"/>
+                <w:b w:val="0"/>
+                <w:sz w:val="20"/>
+              </w:rPr>
+              <w:t>（填写姓名）</w:t>
+            </w:r>
+          </w:p>
+        </w:tc>
+      </w:tr>
+      <w:tr>
+        <w:tc>
+          <w:tcPr>
+            <w:tcW w:type="dxa" w:w="1383"/>
+          </w:tcPr>
+          <w:p>
+            <w:pPr>
+              <w:jc w:val="center"/>
+            </w:pPr>
+            <w:r/>
+            <w:r>
+              <w:rPr>
+                <w:rFonts w:ascii="Times New Roman" w:hAnsi="Times New Roman" w:eastAsia="宋体"/>
+                <w:b w:val="0"/>
+                <w:sz w:val="20"/>
+              </w:rPr>
+              <w:t>2026-08-27</w:t>
+            </w:r>
+          </w:p>
+        </w:tc>
+        <w:tc>
+          <w:tcPr>
+            <w:tcW w:type="dxa" w:w="1383"/>
+          </w:tcPr>
+          <w:p>
+            <w:pPr>
+              <w:jc w:val="center"/>
+            </w:pPr>
+            <w:r/>
+            <w:r>
+              <w:rPr>
+                <w:rFonts w:ascii="Times New Roman" w:hAnsi="Times New Roman" w:eastAsia="宋体"/>
+                <w:b w:val="0"/>
+                <w:sz w:val="20"/>
+              </w:rPr>
+              <w:t>V1.2</w:t>
+            </w:r>
+          </w:p>
+        </w:tc>
+        <w:tc>
+          <w:tcPr>
+            <w:tcW w:type="dxa" w:w="1383"/>
+          </w:tcPr>
+          <w:p>
+            <w:pPr>
+              <w:jc w:val="center"/>
+            </w:pPr>
+            <w:r/>
+            <w:r>
+              <w:rPr>
+                <w:rFonts w:ascii="Times New Roman" w:hAnsi="Times New Roman" w:eastAsia="宋体"/>
+                <w:b w:val="0"/>
+                <w:sz w:val="20"/>
+              </w:rPr>
+              <w:t>—</w:t>
+            </w:r>
+          </w:p>
+        </w:tc>
+        <w:tc>
+          <w:tcPr>
+            <w:tcW w:type="dxa" w:w="1383"/>
+          </w:tcPr>
+          <w:p>
+            <w:pPr>
+              <w:jc w:val="center"/>
+            </w:pPr>
+            <w:r/>
+            <w:r>
+              <w:rPr>
+                <w:rFonts w:ascii="Times New Roman" w:hAnsi="Times New Roman" w:eastAsia="宋体"/>
+                <w:b w:val="0"/>
+                <w:sz w:val="20"/>
+              </w:rPr>
+              <w:t>全部</w:t>
+            </w:r>
+          </w:p>
+        </w:tc>
+        <w:tc>
+          <w:tcPr>
+            <w:tcW w:type="dxa" w:w="1383"/>
+          </w:tcPr>
+          <w:p>
+            <w:pPr>
+              <w:jc w:val="center"/>
+            </w:pPr>
+            <w:r/>
+            <w:r>
+              <w:rPr>
+                <w:rFonts w:ascii="Times New Roman" w:hAnsi="Times New Roman" w:eastAsia="宋体"/>
+                <w:b w:val="0"/>
+                <w:sz w:val="20"/>
+              </w:rPr>
+              <w:t>新增模拟面试历史记录保存与逐题复盘（可点击历史场次回看问题与AI评估）；完善能力画像（多维度雷达图与维度说明同步展示）；新增转行诊断与谈薪模拟模块；代码已推送GitHub（phase 3）。</w:t>
+            </w:r>
+          </w:p>
+        </w:tc>
+        <w:tc>
+          <w:tcPr>
+            <w:tcW w:type="dxa" w:w="1383"/>
+          </w:tcPr>
+          <w:p>
+            <w:pPr>
+              <w:jc w:val="center"/>
+            </w:pPr>
+            <w:r/>
+            <w:r>
+              <w:rPr>
+                <w:rFonts w:ascii="Times New Roman" w:hAnsi="Times New Roman" w:eastAsia="宋体"/>
+                <w:b w:val="0"/>
+                <w:sz w:val="20"/>
+              </w:rPr>
+              <w:t>（填写姓名）</w:t>
+            </w:r>
+          </w:p>
+        </w:tc>
       </w:tr>
     </w:tbl>
     <w:p>
@@ -2242,238 +2010,6 @@
             </w:r>
           </w:p>
         </w:tc>
-        <w:tr>
-          <w:tc>
-            <w:tcPr>
-              <w:tcW w:type="dxa" w:w="1383"/>
-            </w:tcPr>
-            <w:p>
-              <w:pPr>
-                <w:jc w:val="center"/>
-              </w:pPr>
-              <w:r/>
-              <w:r>
-                <w:rPr>
-                  <w:rFonts w:ascii="Times New Roman" w:hAnsi="Times New Roman" w:eastAsia="宋体"/>
-                  <w:b w:val="0"/>
-                  <w:sz w:val="20"/>
-                </w:rPr>
-                <w:t>2026-08-27</w:t>
-              </w:r>
-            </w:p>
-          </w:tc>
-          <w:tc>
-            <w:tcPr>
-              <w:tcW w:type="dxa" w:w="1383"/>
-            </w:tcPr>
-            <w:p>
-              <w:pPr>
-                <w:jc w:val="center"/>
-              </w:pPr>
-              <w:r/>
-              <w:r>
-                <w:rPr>
-                  <w:rFonts w:ascii="Times New Roman" w:hAnsi="Times New Roman" w:eastAsia="宋体"/>
-                  <w:b w:val="0"/>
-                  <w:sz w:val="20"/>
-                </w:rPr>
-                <w:t>V1.1</w:t>
-              </w:r>
-            </w:p>
-          </w:tc>
-          <w:tc>
-            <w:tcPr>
-              <w:tcW w:type="dxa" w:w="1383"/>
-            </w:tcPr>
-            <w:p>
-              <w:pPr>
-                <w:jc w:val="center"/>
-              </w:pPr>
-              <w:r/>
-              <w:r>
-                <w:rPr>
-                  <w:rFonts w:ascii="Times New Roman" w:hAnsi="Times New Roman" w:eastAsia="宋体"/>
-                  <w:b w:val="0"/>
-                  <w:sz w:val="20"/>
-                </w:rPr>
-                <w:t>—</w:t>
-              </w:r>
-            </w:p>
-          </w:tc>
-          <w:tc>
-            <w:tcPr>
-              <w:tcW w:type="dxa" w:w="1383"/>
-            </w:tcPr>
-            <w:p>
-              <w:pPr>
-                <w:jc w:val="center"/>
-              </w:pPr>
-              <w:r/>
-              <w:r>
-                <w:rPr>
-                  <w:rFonts w:ascii="Times New Roman" w:hAnsi="Times New Roman" w:eastAsia="宋体"/>
-                  <w:b w:val="0"/>
-                  <w:sz w:val="20"/>
-                </w:rPr>
-                <w:t>3.4</w:t>
-              </w:r>
-            </w:p>
-          </w:tc>
-          <w:tc>
-            <w:tcPr>
-              <w:tcW w:type="dxa" w:w="1383"/>
-            </w:tcPr>
-            <w:p>
-              <w:pPr>
-                <w:jc w:val="center"/>
-              </w:pPr>
-              <w:r/>
-              <w:r>
-                <w:rPr>
-                  <w:rFonts w:ascii="Times New Roman" w:hAnsi="Times New Roman" w:eastAsia="宋体"/>
-                  <w:b w:val="0"/>
-                  <w:sz w:val="20"/>
-                </w:rPr>
-                <w:t>新增 JD 历史保存/选择与多简历选择诊断：用户可保存多份岗位 JD 并在诊断时选择历史 JD；上传多份简历时可选特定一份参与简历×JD 匹配计算；修复前端白屏问题（preserveSymlinks 处理中文路径编码）。</w:t>
-              </w:r>
-            </w:p>
-          </w:tc>
-          <w:tc>
-            <w:tcPr>
-              <w:tcW w:type="dxa" w:w="1383"/>
-            </w:tcPr>
-            <w:p>
-              <w:pPr>
-                <w:jc w:val="center"/>
-              </w:pPr>
-              <w:r/>
-              <w:r>
-                <w:rPr>
-                  <w:rFonts w:ascii="Times New Roman" w:hAnsi="Times New Roman" w:eastAsia="宋体"/>
-                  <w:b w:val="0"/>
-                  <w:sz w:val="20"/>
-                </w:rPr>
-                <w:t>（填写姓名）</w:t>
-              </w:r>
-            </w:p>
-          </w:tc>
-        </w:tr>
-        <w:tr>
-          <w:tc>
-            <w:tcPr>
-              <w:tcW w:type="dxa" w:w="1383"/>
-            </w:tcPr>
-            <w:p>
-              <w:pPr>
-                <w:jc w:val="center"/>
-              </w:pPr>
-              <w:r/>
-              <w:r>
-                <w:rPr>
-                  <w:rFonts w:ascii="Times New Roman" w:hAnsi="Times New Roman" w:eastAsia="宋体"/>
-                  <w:b w:val="0"/>
-                  <w:sz w:val="20"/>
-                </w:rPr>
-                <w:t>2026-08-27</w:t>
-              </w:r>
-            </w:p>
-          </w:tc>
-          <w:tc>
-            <w:tcPr>
-              <w:tcW w:type="dxa" w:w="1383"/>
-            </w:tcPr>
-            <w:p>
-              <w:pPr>
-                <w:jc w:val="center"/>
-              </w:pPr>
-              <w:r/>
-              <w:r>
-                <w:rPr>
-                  <w:rFonts w:ascii="Times New Roman" w:hAnsi="Times New Roman" w:eastAsia="宋体"/>
-                  <w:b w:val="0"/>
-                  <w:sz w:val="20"/>
-                </w:rPr>
-                <w:t>V1.2</w:t>
-              </w:r>
-            </w:p>
-          </w:tc>
-          <w:tc>
-            <w:tcPr>
-              <w:tcW w:type="dxa" w:w="1383"/>
-            </w:tcPr>
-            <w:p>
-              <w:pPr>
-                <w:jc w:val="center"/>
-              </w:pPr>
-              <w:r/>
-              <w:r>
-                <w:rPr>
-                  <w:rFonts w:ascii="Times New Roman" w:hAnsi="Times New Roman" w:eastAsia="宋体"/>
-                  <w:b w:val="0"/>
-                  <w:sz w:val="20"/>
-                </w:rPr>
-                <w:t>—</w:t>
-              </w:r>
-            </w:p>
-          </w:tc>
-          <w:tc>
-            <w:tcPr>
-              <w:tcW w:type="dxa" w:w="1383"/>
-            </w:tcPr>
-            <w:p>
-              <w:pPr>
-                <w:jc w:val="center"/>
-              </w:pPr>
-              <w:r/>
-              <w:r>
-                <w:rPr>
-                  <w:rFonts w:ascii="Times New Roman" w:hAnsi="Times New Roman" w:eastAsia="宋体"/>
-                  <w:b w:val="0"/>
-                  <w:sz w:val="20"/>
-                </w:rPr>
-                <w:t>全部</w:t>
-              </w:r>
-            </w:p>
-          </w:tc>
-          <w:tc>
-            <w:tcPr>
-              <w:tcW w:type="dxa" w:w="1383"/>
-            </w:tcPr>
-            <w:p>
-              <w:pPr>
-                <w:jc w:val="center"/>
-              </w:pPr>
-              <w:r/>
-              <w:r>
-                <w:rPr>
-                  <w:rFonts w:ascii="Times New Roman" w:hAnsi="Times New Roman" w:eastAsia="宋体"/>
-                  <w:b w:val="0"/>
-                  <w:sz w:val="20"/>
-                </w:rPr>
-                <w:t>新增模拟面试历史记录保存与逐题复盘（可点击历史场次回看问题与AI评估）；完善能力画像（多维度雷达图与维度说明同步展示）；新增转行诊断与谈薪模拟模块；代码已推送GitHub（phase 3）。</w:t>
-              </w:r>
-            </w:p>
-          </w:tc>
-          <w:tc>
-            <w:tcPr>
-              <w:tcW w:type="dxa" w:w="1383"/>
-            </w:tcPr>
-            <w:p>
-              <w:pPr>
-                <w:jc w:val="center"/>
-              </w:pPr>
-              <w:r/>
-              <w:r>
-                <w:rPr>
-                  <w:rFonts w:ascii="Times New Roman" w:hAnsi="Times New Roman" w:eastAsia="宋体"/>
-                  <w:b w:val="0"/>
-                  <w:sz w:val="20"/>
-                </w:rPr>
-                <w:t>（填写姓名）</w:t>
-              </w:r>
-            </w:p>
-          </w:tc>
-        </w:tr>
       </w:tr>
     </w:tbl>
     <w:p>

</xml_diff>

<commit_message>
feat: AI interviewer, real job data crawler & auto sync, job market (phase 5)
</commit_message>
<xml_diff>
--- a/docs/学号_姓名_Project Start Report_V1.0.docx
+++ b/docs/学号_姓名_Project Start Report_V1.0.docx
@@ -1005,7 +1005,7 @@
           <w:rFonts w:ascii="Times New Roman" w:hAnsi="Times New Roman" w:eastAsia="宋体"/>
           <w:b w:val="0"/>
         </w:rPr>
-        <w:t>本项目面向求职者（而非招聘方），基于大语言模型（LLM）构建一套"AI 模拟面试官 + 职业规划"Web 系统。系统提供简历×JD 智能匹配诊断、基于候选人回答动态追问的模拟面试、逐题复盘与能力成长追踪、转行诊断、谈薪模拟等能力，形成"面试 → 评估 → 规划 → 学习"的求职全链路闭环。技术路线采用 Python（FastAPI + LangChain + 向量检索），前端使用 React。</w:t>
+        <w:t>本项目面向求职者（而非招聘方），基于大语言模型（LLM）构建一套"AI 模拟面试官 + 职业规划"Web 系统。系统提供简历×JD 智能匹配诊断、岗位广场（岗位卡片一键发起面试）、基于候选人回答动态追问的模拟面试（可选面试官角色与难度）、逐题复盘与能力成长追踪、转行诊断、谈薪模拟等能力，形成"面试 → 评估 → 规划 → 学习"的求职全链路闭环。全站采用向导式分步交互与清爽极简视觉风格。技术路线采用 Python（FastAPI + LangChain + 向量检索），前端使用 Vue 3。</w:t>
       </w:r>
     </w:p>
     <w:p>
@@ -1100,6 +1100,21 @@
       </w:r>
     </w:p>
     <w:p>
+      <w:r>
+        <w:t>7. 提供岗位广场与岗位导向的面试入口：岗位卡片一键发起针对该岗位的模拟面试，岗位覆盖主要技术方向；</w:t>
+      </w:r>
+    </w:p>
+    <w:p>
+      <w:r>
+        <w:t>8. 面试可自定义面试官角色与难度：创建面试时选择面试官（如 CTO 技术面 / HR 综合面 / 压力面）与难度（简单 / 标准 / 困难）；</w:t>
+      </w:r>
+    </w:p>
+    <w:p>
+      <w:r>
+        <w:t>9. 全站采用向导式分步交互与清爽视觉：功能页面统一"步骤条 + 单卡片 + 底部导航"布局，侧边栏弱化、留白充足。</w:t>
+      </w:r>
+    </w:p>
+    <w:p>
       <w:pPr>
         <w:spacing w:before="160" w:after="40"/>
         <w:jc w:val="left"/>
@@ -1122,7 +1137,7 @@
           <w:rFonts w:ascii="Times New Roman" w:hAnsi="Times New Roman" w:eastAsia="宋体"/>
           <w:b w:val="0"/>
         </w:rPr>
-        <w:t>（1）范围内：求职者端 Web 应用，包括用户与系统管理、简历×JD 诊断、模拟面试、复盘追踪、转行诊断、谈薪模拟、题库与学习路线；</w:t>
+        <w:t>（1）范围内：求职者端 Web 应用，包括用户与系统管理、简历×JD 诊断、岗位广场（岗位卡片一键面试）、模拟面试（可选面试官与难度）、复盘追踪、转行诊断、谈薪模拟、题库与学习路线；</w:t>
       </w:r>
     </w:p>
     <w:p>

</xml_diff>